<commit_message>
Update Streamlit navigation and split PDF
</commit_message>
<xml_diff>
--- a/templates/Aptitude_Trainer_Profile_Template.docx
+++ b/templates/Aptitude_Trainer_Profile_Template.docx
@@ -1387,6 +1387,26 @@
         </w:rPr>
         <w:lastRenderedPageBreak/>
         <w:t>Training Projects:</w:t>
+      </w:r>
+    </w:p>
+    <w:p>
+      <w:pPr>
+        <w:spacing w:before="200" w:after="120"/>
+        <w:rPr>
+          <w:b/>
+          <w:bCs/>
+          <w:sz w:val="24"/>
+          <w:szCs w:val="24"/>
+        </w:rPr>
+      </w:pPr>
+      <w:r>
+        <w:rPr>
+          <w:b/>
+          <w:bCs/>
+          <w:sz w:val="24"/>
+          <w:szCs w:val="24"/>
+        </w:rPr>
+        <w:t>{{Training Projects}}</w:t>
       </w:r>
     </w:p>
     <w:sectPr>
@@ -2671,7 +2691,6 @@
   <w:style w:type="character" w:default="1" w:styleId="DefaultParagraphFont">
     <w:name w:val="Default Paragraph Font"/>
     <w:uiPriority w:val="1"/>
-    <w:semiHidden/>
     <w:unhideWhenUsed/>
   </w:style>
   <w:style w:type="table" w:default="1" w:styleId="TableNormal">

</xml_diff>